<commit_message>
Add Week 5 comprehensive data science capstone report
</commit_message>
<xml_diff>
--- a/Week5-Comprehensive-Data-Science-Project/Week5_Comprehensive_Data_Science_Capstone_Report.docx
+++ b/Week5-Comprehensive-Data-Science-Project/Week5_Comprehensive_Data_Science_Capstone_Report.docx
@@ -242,11 +242,6 @@
       </w:r>
     </w:p>
     <w:p>
-      <w:r>
-        <w:br w:type="page"/>
-      </w:r>
-    </w:p>
-    <w:p>
       <w:pPr>
         <w:pStyle w:val="Heading2"/>
       </w:pPr>
@@ -348,11 +343,6 @@
     <w:p>
       <w:r>
         <w:t>Interpretation: Compares medians, quartiles and means to show cohort patterns without assuming all students improved.</w:t>
-      </w:r>
-    </w:p>
-    <w:p>
-      <w:r>
-        <w:br w:type="page"/>
       </w:r>
     </w:p>
     <w:p>
@@ -465,11 +455,6 @@
       </w:r>
     </w:p>
     <w:p>
-      <w:r>
-        <w:br w:type="page"/>
-      </w:r>
-    </w:p>
-    <w:p>
       <w:pPr>
         <w:pStyle w:val="Heading2"/>
       </w:pPr>
@@ -571,11 +556,6 @@
     <w:p>
       <w:r>
         <w:t>Interpretation: Shows how candidate algorithms compare using training-only validation, with fold variability.</w:t>
-      </w:r>
-    </w:p>
-    <w:p>
-      <w:r>
-        <w:br w:type="page"/>
       </w:r>
     </w:p>
     <w:p>
@@ -685,11 +665,6 @@
     <w:p>
       <w:r>
         <w:t>Test ROC-AUC of 0.595 is only modestly above 0.50 chance-level ranking. This is a central limitation, not a success claim.</w:t>
-      </w:r>
-    </w:p>
-    <w:p>
-      <w:r>
-        <w:br w:type="page"/>
       </w:r>
     </w:p>
     <w:p>

</xml_diff>

<commit_message>
Publish final Week 5 comprehensive data science capstone
</commit_message>
<xml_diff>
--- a/Week5-Comprehensive-Data-Science-Project/Week5_Comprehensive_Data_Science_Capstone_Report.docx
+++ b/Week5-Comprehensive-Data-Science-Project/Week5_Comprehensive_Data_Science_Capstone_Report.docx
@@ -896,7 +896,9 @@
           <w:rFonts w:ascii="Consolas" w:hAnsi="Consolas"/>
           <w:sz w:val="16"/>
         </w:rPr>
-        <w:t>df["target_pass"] = (df["G3"] &gt;= 10).astype(int)\nX = df.drop(columns=["G1", "G2", "G3", "target_pass"])</w:t>
+        <w:t>df["target_pass"] = (df["G3"] &gt;= 10).astype(int)</w:t>
+        <w:br/>
+        <w:t>X = df.drop(columns=["G1", "G2", "G3", "target_pass"])</w:t>
       </w:r>
     </w:p>
     <w:p>
@@ -913,7 +915,9 @@
           <w:rFonts w:ascii="Consolas" w:hAnsi="Consolas"/>
           <w:sz w:val="16"/>
         </w:rPr>
-        <w:t>cv = StratifiedKFold(n_splits=5, shuffle=True, random_state=42)\nscores = cross_validate(model, X_train, y_train, cv=cv, scoring="roc_auc")</w:t>
+        <w:t>cv = StratifiedKFold(n_splits=5, shuffle=True, random_state=42)</w:t>
+        <w:br/>
+        <w:t>scores = cross_validate(model, X_train, y_train, cv=cv, scoring="roc_auc")</w:t>
       </w:r>
     </w:p>
     <w:p>
@@ -930,7 +934,9 @@
           <w:rFonts w:ascii="Consolas" w:hAnsi="Consolas"/>
           <w:sz w:val="16"/>
         </w:rPr>
-        <w:t>test = stats.ttest_ind(no_failures, prior_failures,\n                         equal_var=False, alternative="greater")</w:t>
+        <w:t>test = stats.ttest_ind(no_failures, prior_failures,</w:t>
+        <w:br/>
+        <w:t xml:space="preserve">                         equal_var=False, alternative="greater")</w:t>
       </w:r>
     </w:p>
     <w:p>

</xml_diff>